<commit_message>
Tsunamibølgers hastighed: bedroller og dybderne 2,5, 5 og 10 cm; ingen fed skrift i brødteksten
1 cm vand er for lidt i en bedroller, så dybderne er nu 0,025, 0,05 og
0,10 m, og grafen går til 0,12 m. Tippet om at løfte mindre, så bunden ikke
blev tør, er fjernet: det strider mod figuren og er overflødigt ved de nye
dybder. Opstillingen er tegnet om med et højere kar og 5 cm vand, hvor
overfladen står vandret og vandet er dybest i ende B.

Enkeltord med fed skrift i brødteksten er fjernet i både tsunami- og
viskositetsvejledningen. Begge er renderet igen i alle tre formater.

Co-Authored-By: Claude Opus 5.5 <noreply@anthropic.com>
Claude-Session: https://claude.ai/code/session_017ZZDVYGdt2eCg6b74LUvcs
</commit_message>
<xml_diff>
--- a/Øvelser/Geografi/lavas-viskositet/lavas-viskositet.docx
+++ b/Øvelser/Geografi/lavas-viskositet/lavas-viskositet.docx
@@ -84,20 +84,7 @@
         <w:pStyle w:val="FirstParagraph"/>
       </w:pPr>
       <w:r>
-        <w:t xml:space="preserve">En væskes sejhed kaldes dens</w:t>
-      </w:r>
-      <w:r>
-        <w:t xml:space="preserve"> </w:t>
-      </w:r>
-      <w:r>
-        <w:rPr>
-          <w:b/>
-          <w:bCs/>
-        </w:rPr>
-        <w:t xml:space="preserve">viskositet</w:t>
-      </w:r>
-      <w:r>
-        <w:t xml:space="preserve">. Jo større viskositet en væske har, jo mere tyktflydende er den, og jo langsommere flyder den ned ad en skråning. Vand har en lille viskositet, sirup en stor.</w:t>
+        <w:t xml:space="preserve">En væskes sejhed kaldes dens viskositet. Jo større viskositet en væske har, jo mere tyktflydende er den, og jo langsommere flyder den ned ad en skråning. Vand har en lille viskositet, sirup en stor.</w:t>
       </w:r>
     </w:p>
     <w:p>
@@ -123,23 +110,7 @@
         <w:pStyle w:val="FirstParagraph"/>
       </w:pPr>
       <w:r>
-        <w:t xml:space="preserve">Sæt de fire væsker i rækkefølge fra den mest tyndtflydende til den mest tyktflydende,</w:t>
-      </w:r>
-      <w:r>
-        <w:t xml:space="preserve"> </w:t>
-      </w:r>
-      <w:r>
-        <w:rPr>
-          <w:b/>
-          <w:bCs/>
-        </w:rPr>
-        <w:t xml:space="preserve">inden</w:t>
-      </w:r>
-      <w:r>
-        <w:t xml:space="preserve"> </w:t>
-      </w:r>
-      <w:r>
-        <w:t xml:space="preserve">I måler. Begrund kort jeres bud.</w:t>
+        <w:t xml:space="preserve">Sæt de fire væsker i rækkefølge fra den mest tyndtflydende til den mest tyktflydende, inden I måler. Begrund kort jeres bud.</w:t>
       </w:r>
     </w:p>
     <w:p>
@@ -359,20 +330,7 @@
         </w:numPr>
       </w:pPr>
       <w:r>
-        <w:t xml:space="preserve">Tegn med linealen en vandret streg øverst på papiret, og skriv 0 cm ved den. Det er</w:t>
-      </w:r>
-      <w:r>
-        <w:t xml:space="preserve"> </w:t>
-      </w:r>
-      <w:r>
-        <w:rPr>
-          <w:b/>
-          <w:bCs/>
-        </w:rPr>
-        <w:t xml:space="preserve">startlinjen</w:t>
-      </w:r>
-      <w:r>
-        <w:t xml:space="preserve">.</w:t>
+        <w:t xml:space="preserve">Tegn med linealen en vandret streg øverst på papiret, og skriv 0 cm ved den. Det er startlinjen.</w:t>
       </w:r>
     </w:p>
     <w:p>
@@ -384,20 +342,7 @@
         </w:numPr>
       </w:pPr>
       <w:r>
-        <w:t xml:space="preserve">Mål 25 cm ned fra startlinjen, og tegn endnu en vandret streg. Skriv 25 cm ved den. Det er</w:t>
-      </w:r>
-      <w:r>
-        <w:t xml:space="preserve"> </w:t>
-      </w:r>
-      <w:r>
-        <w:rPr>
-          <w:b/>
-          <w:bCs/>
-        </w:rPr>
-        <w:t xml:space="preserve">målstregen</w:t>
-      </w:r>
-      <w:r>
-        <w:t xml:space="preserve">.</w:t>
+        <w:t xml:space="preserve">Mål 25 cm ned fra startlinjen, og tegn endnu en vandret streg. Skriv 25 cm ved den. Det er målstregen.</w:t>
       </w:r>
     </w:p>
     <w:p>

</xml_diff>